<commit_message>
almost finish 2nd alg
</commit_message>
<xml_diff>
--- a/docs/KT2/Текст программы.docx
+++ b/docs/KT2/Текст программы.docx
@@ -3870,8 +3870,12 @@
     <w:p>
       <w:pPr>
         <w:pStyle w:val="a"/>
-      </w:pPr>
-      <w:bookmarkStart w:id="0" w:name="_Toc221121384"/>
+        <w:numPr>
+          <w:ilvl w:val="0"/>
+          <w:numId w:val="0"/>
+        </w:numPr>
+      </w:pPr>
+      <w:bookmarkStart w:id="0" w:name="_Toc229152399"/>
       <w:r>
         <w:lastRenderedPageBreak/>
         <w:t>АННОТАЦИЯ</w:t>
@@ -3891,283 +3895,745 @@
     </w:p>
     <w:p>
       <w:pPr>
-        <w:pStyle w:val="ad"/>
+        <w:spacing w:line="278" w:lineRule="auto"/>
+        <w:rPr>
+          <w:rFonts w:ascii="Times New Roman" w:hAnsi="Times New Roman" w:cs="Times New Roman"/>
+          <w:sz w:val="24"/>
+          <w:szCs w:val="24"/>
+        </w:rPr>
       </w:pPr>
       <w:r>
-        <w:t xml:space="preserve">В данном программном документе приведен текст классов для генерации и интерактивного редактирования </w:t>
+        <w:rPr>
+          <w:rFonts w:ascii="Times New Roman" w:hAnsi="Times New Roman" w:cs="Times New Roman"/>
+          <w:sz w:val="24"/>
+          <w:szCs w:val="24"/>
+        </w:rPr>
+        <w:t>В данном программном документе приведен</w:t>
+      </w:r>
+      <w:r>
+        <w:rPr>
+          <w:rFonts w:ascii="Times New Roman" w:hAnsi="Times New Roman" w:cs="Times New Roman"/>
+          <w:sz w:val="24"/>
+          <w:szCs w:val="24"/>
+        </w:rPr>
+        <w:t>ы программы, реализующие весь функционал приложения</w:t>
+      </w:r>
+      <w:r>
+        <w:rPr>
+          <w:rFonts w:ascii="Times New Roman" w:hAnsi="Times New Roman" w:cs="Times New Roman"/>
+          <w:sz w:val="24"/>
+          <w:szCs w:val="24"/>
+        </w:rPr>
+        <w:t xml:space="preserve">. </w:t>
+      </w:r>
+      <w:r>
+        <w:rPr>
+          <w:rFonts w:ascii="Times New Roman" w:hAnsi="Times New Roman" w:cs="Times New Roman"/>
+          <w:sz w:val="24"/>
+          <w:szCs w:val="24"/>
+        </w:rPr>
+        <w:t>Программа позволяет выполнять следующие действия:</w:t>
+      </w:r>
+    </w:p>
+    <w:p>
+      <w:pPr>
+        <w:pStyle w:val="a9"/>
+        <w:numPr>
+          <w:ilvl w:val="0"/>
+          <w:numId w:val="9"/>
+        </w:numPr>
+        <w:spacing w:line="278" w:lineRule="auto"/>
+        <w:rPr>
+          <w:rFonts w:ascii="Times New Roman" w:hAnsi="Times New Roman" w:cs="Times New Roman"/>
+          <w:sz w:val="24"/>
+          <w:szCs w:val="24"/>
+        </w:rPr>
+      </w:pPr>
+      <w:r>
+        <w:rPr>
+          <w:rFonts w:ascii="Times New Roman" w:hAnsi="Times New Roman" w:cs="Times New Roman"/>
+          <w:sz w:val="24"/>
+          <w:szCs w:val="24"/>
+        </w:rPr>
+        <w:t>Управление учетной записью:</w:t>
+      </w:r>
+    </w:p>
+    <w:p>
+      <w:pPr>
+        <w:pStyle w:val="a9"/>
+        <w:numPr>
+          <w:ilvl w:val="1"/>
+          <w:numId w:val="9"/>
+        </w:numPr>
+        <w:spacing w:line="278" w:lineRule="auto"/>
+        <w:rPr>
+          <w:rFonts w:ascii="Times New Roman" w:hAnsi="Times New Roman" w:cs="Times New Roman"/>
+          <w:sz w:val="24"/>
+          <w:szCs w:val="24"/>
+        </w:rPr>
+      </w:pPr>
+      <w:r>
+        <w:rPr>
+          <w:rFonts w:ascii="Times New Roman" w:hAnsi="Times New Roman" w:cs="Times New Roman"/>
+          <w:sz w:val="24"/>
+          <w:szCs w:val="24"/>
+        </w:rPr>
+        <w:t xml:space="preserve">Регистрация нового пользователя по </w:t>
       </w:r>
       <w:proofErr w:type="spellStart"/>
       <w:r>
-        <w:t>графовых</w:t>
+        <w:rPr>
+          <w:rFonts w:ascii="Times New Roman" w:hAnsi="Times New Roman" w:cs="Times New Roman"/>
+          <w:sz w:val="24"/>
+          <w:szCs w:val="24"/>
+        </w:rPr>
+        <w:t>email</w:t>
       </w:r>
       <w:proofErr w:type="spellEnd"/>
       <w:r>
-        <w:t xml:space="preserve"> уровней. Текст программы реализован в виде символической записи на исходном языке. Исходным языком данной разработки является C#. Среда разработки и компилятор — </w:t>
+        <w:rPr>
+          <w:rFonts w:ascii="Times New Roman" w:hAnsi="Times New Roman" w:cs="Times New Roman"/>
+          <w:sz w:val="24"/>
+          <w:szCs w:val="24"/>
+        </w:rPr>
+        <w:t xml:space="preserve"> и паролю</w:t>
+      </w:r>
+    </w:p>
+    <w:p>
+      <w:pPr>
+        <w:pStyle w:val="a9"/>
+        <w:numPr>
+          <w:ilvl w:val="1"/>
+          <w:numId w:val="9"/>
+        </w:numPr>
+        <w:spacing w:line="278" w:lineRule="auto"/>
+        <w:rPr>
+          <w:rFonts w:ascii="Times New Roman" w:hAnsi="Times New Roman" w:cs="Times New Roman"/>
+          <w:sz w:val="24"/>
+          <w:szCs w:val="24"/>
+        </w:rPr>
+      </w:pPr>
+      <w:r>
+        <w:rPr>
+          <w:rFonts w:ascii="Times New Roman" w:hAnsi="Times New Roman" w:cs="Times New Roman"/>
+          <w:sz w:val="24"/>
+          <w:szCs w:val="24"/>
+        </w:rPr>
+        <w:t xml:space="preserve">Вход в аккаунт по </w:t>
       </w:r>
       <w:proofErr w:type="spellStart"/>
       <w:r>
-        <w:t>Unity</w:t>
+        <w:rPr>
+          <w:rFonts w:ascii="Times New Roman" w:hAnsi="Times New Roman" w:cs="Times New Roman"/>
+          <w:sz w:val="24"/>
+          <w:szCs w:val="24"/>
+        </w:rPr>
+        <w:t>email</w:t>
       </w:r>
       <w:proofErr w:type="spellEnd"/>
       <w:r>
-        <w:t xml:space="preserve"> Engine и Microsoft Visual </w:t>
+        <w:rPr>
+          <w:rFonts w:ascii="Times New Roman" w:hAnsi="Times New Roman" w:cs="Times New Roman"/>
+          <w:sz w:val="24"/>
+          <w:szCs w:val="24"/>
+        </w:rPr>
+        <w:t xml:space="preserve"> и паролю</w:t>
+      </w:r>
+    </w:p>
+    <w:p>
+      <w:pPr>
+        <w:pStyle w:val="a9"/>
+        <w:numPr>
+          <w:ilvl w:val="1"/>
+          <w:numId w:val="9"/>
+        </w:numPr>
+        <w:spacing w:line="278" w:lineRule="auto"/>
+        <w:rPr>
+          <w:rFonts w:ascii="Times New Roman" w:hAnsi="Times New Roman" w:cs="Times New Roman"/>
+          <w:sz w:val="24"/>
+          <w:szCs w:val="24"/>
+        </w:rPr>
+      </w:pPr>
+      <w:r>
+        <w:rPr>
+          <w:rFonts w:ascii="Times New Roman" w:hAnsi="Times New Roman" w:cs="Times New Roman"/>
+          <w:sz w:val="24"/>
+          <w:szCs w:val="24"/>
+        </w:rPr>
+        <w:t>Сброс пароля через электронную почту</w:t>
+      </w:r>
+    </w:p>
+    <w:p>
+      <w:pPr>
+        <w:pStyle w:val="a9"/>
+        <w:numPr>
+          <w:ilvl w:val="0"/>
+          <w:numId w:val="9"/>
+        </w:numPr>
+        <w:spacing w:line="278" w:lineRule="auto"/>
+        <w:rPr>
+          <w:rFonts w:ascii="Times New Roman" w:hAnsi="Times New Roman" w:cs="Times New Roman"/>
+          <w:sz w:val="24"/>
+          <w:szCs w:val="24"/>
+        </w:rPr>
+      </w:pPr>
+      <w:r>
+        <w:rPr>
+          <w:rFonts w:ascii="Times New Roman" w:hAnsi="Times New Roman" w:cs="Times New Roman"/>
+          <w:sz w:val="24"/>
+          <w:szCs w:val="24"/>
+        </w:rPr>
+        <w:t>Управление профилем:</w:t>
+      </w:r>
+    </w:p>
+    <w:p>
+      <w:pPr>
+        <w:pStyle w:val="a9"/>
+        <w:numPr>
+          <w:ilvl w:val="1"/>
+          <w:numId w:val="9"/>
+        </w:numPr>
+        <w:spacing w:line="278" w:lineRule="auto"/>
+        <w:rPr>
+          <w:rFonts w:ascii="Times New Roman" w:hAnsi="Times New Roman" w:cs="Times New Roman"/>
+          <w:sz w:val="24"/>
+          <w:szCs w:val="24"/>
+        </w:rPr>
+      </w:pPr>
+      <w:r>
+        <w:rPr>
+          <w:rFonts w:ascii="Times New Roman" w:hAnsi="Times New Roman" w:cs="Times New Roman"/>
+          <w:sz w:val="24"/>
+          <w:szCs w:val="24"/>
+        </w:rPr>
+        <w:t>Просмотр аватара, имени и электронной почты</w:t>
+      </w:r>
+    </w:p>
+    <w:p>
+      <w:pPr>
+        <w:pStyle w:val="a9"/>
+        <w:numPr>
+          <w:ilvl w:val="1"/>
+          <w:numId w:val="9"/>
+        </w:numPr>
+        <w:spacing w:line="278" w:lineRule="auto"/>
+        <w:rPr>
+          <w:rFonts w:ascii="Times New Roman" w:hAnsi="Times New Roman" w:cs="Times New Roman"/>
+          <w:sz w:val="24"/>
+          <w:szCs w:val="24"/>
+        </w:rPr>
+      </w:pPr>
+      <w:r>
+        <w:rPr>
+          <w:rFonts w:ascii="Times New Roman" w:hAnsi="Times New Roman" w:cs="Times New Roman"/>
+          <w:sz w:val="24"/>
+          <w:szCs w:val="24"/>
+        </w:rPr>
+        <w:t>Редактирование имени с валидацией</w:t>
+      </w:r>
+    </w:p>
+    <w:p>
+      <w:pPr>
+        <w:pStyle w:val="a9"/>
+        <w:numPr>
+          <w:ilvl w:val="1"/>
+          <w:numId w:val="9"/>
+        </w:numPr>
+        <w:spacing w:line="278" w:lineRule="auto"/>
+        <w:rPr>
+          <w:rFonts w:ascii="Times New Roman" w:hAnsi="Times New Roman" w:cs="Times New Roman"/>
+          <w:sz w:val="24"/>
+          <w:szCs w:val="24"/>
+        </w:rPr>
+      </w:pPr>
+      <w:r>
+        <w:rPr>
+          <w:rFonts w:ascii="Times New Roman" w:hAnsi="Times New Roman" w:cs="Times New Roman"/>
+          <w:sz w:val="24"/>
+          <w:szCs w:val="24"/>
+        </w:rPr>
+        <w:t>Выбор аватара из предустановленного набора</w:t>
+      </w:r>
+    </w:p>
+    <w:p>
+      <w:pPr>
+        <w:pStyle w:val="a9"/>
+        <w:numPr>
+          <w:ilvl w:val="1"/>
+          <w:numId w:val="9"/>
+        </w:numPr>
+        <w:spacing w:line="278" w:lineRule="auto"/>
+        <w:rPr>
+          <w:rFonts w:ascii="Times New Roman" w:hAnsi="Times New Roman" w:cs="Times New Roman"/>
+          <w:sz w:val="24"/>
+          <w:szCs w:val="24"/>
+        </w:rPr>
+      </w:pPr>
+      <w:r>
+        <w:rPr>
+          <w:rFonts w:ascii="Times New Roman" w:hAnsi="Times New Roman" w:cs="Times New Roman"/>
+          <w:sz w:val="24"/>
+          <w:szCs w:val="24"/>
+        </w:rPr>
+        <w:t xml:space="preserve">Смена пароля через </w:t>
       </w:r>
       <w:proofErr w:type="spellStart"/>
       <w:r>
-        <w:t>studio</w:t>
+        <w:rPr>
+          <w:rFonts w:ascii="Times New Roman" w:hAnsi="Times New Roman" w:cs="Times New Roman"/>
+          <w:sz w:val="24"/>
+          <w:szCs w:val="24"/>
+        </w:rPr>
+        <w:t>Firebase</w:t>
       </w:r>
       <w:proofErr w:type="spellEnd"/>
+    </w:p>
+    <w:p>
+      <w:pPr>
+        <w:pStyle w:val="a9"/>
+        <w:numPr>
+          <w:ilvl w:val="0"/>
+          <w:numId w:val="9"/>
+        </w:numPr>
+        <w:spacing w:line="278" w:lineRule="auto"/>
+        <w:rPr>
+          <w:rFonts w:ascii="Times New Roman" w:hAnsi="Times New Roman" w:cs="Times New Roman"/>
+          <w:sz w:val="24"/>
+          <w:szCs w:val="24"/>
+        </w:rPr>
+      </w:pPr>
       <w:r>
-        <w:t>.</w:t>
+        <w:rPr>
+          <w:rFonts w:ascii="Times New Roman" w:hAnsi="Times New Roman" w:cs="Times New Roman"/>
+          <w:sz w:val="24"/>
+          <w:szCs w:val="24"/>
+        </w:rPr>
+        <w:t>Настройки приложения:</w:t>
       </w:r>
     </w:p>
     <w:p>
       <w:pPr>
-        <w:pStyle w:val="ad"/>
+        <w:pStyle w:val="a9"/>
+        <w:numPr>
+          <w:ilvl w:val="1"/>
+          <w:numId w:val="9"/>
+        </w:numPr>
+        <w:spacing w:line="278" w:lineRule="auto"/>
+        <w:rPr>
+          <w:rFonts w:ascii="Times New Roman" w:hAnsi="Times New Roman" w:cs="Times New Roman"/>
+          <w:sz w:val="24"/>
+          <w:szCs w:val="24"/>
+        </w:rPr>
       </w:pPr>
       <w:r>
-        <w:t>Основн</w:t>
-      </w:r>
-      <w:r>
-        <w:t xml:space="preserve">ая задача классов - </w:t>
-      </w:r>
-      <w:r>
-        <w:t xml:space="preserve">автоматическое создание уровня </w:t>
-      </w:r>
-      <w:r>
-        <w:t xml:space="preserve">в виде графа </w:t>
-      </w:r>
-      <w:r>
-        <w:t>на основе триангуляции Делоне и предоставление пользователю инструмента</w:t>
-      </w:r>
-      <w:r>
-        <w:t>рия</w:t>
-      </w:r>
-      <w:r>
-        <w:t xml:space="preserve"> для интерактивного изменения его топологии.</w:t>
+        <w:rPr>
+          <w:rFonts w:ascii="Times New Roman" w:hAnsi="Times New Roman" w:cs="Times New Roman"/>
+          <w:sz w:val="24"/>
+          <w:szCs w:val="24"/>
+        </w:rPr>
+        <w:t>Регулировка громкости фоновой музыки</w:t>
       </w:r>
     </w:p>
     <w:p>
       <w:pPr>
-        <w:pStyle w:val="ad"/>
+        <w:pStyle w:val="a9"/>
+        <w:numPr>
+          <w:ilvl w:val="1"/>
+          <w:numId w:val="9"/>
+        </w:numPr>
+        <w:spacing w:line="278" w:lineRule="auto"/>
+        <w:rPr>
+          <w:rFonts w:ascii="Times New Roman" w:hAnsi="Times New Roman" w:cs="Times New Roman"/>
+          <w:sz w:val="24"/>
+          <w:szCs w:val="24"/>
+        </w:rPr>
       </w:pPr>
       <w:r>
-        <w:t>Процесс работы состоит из следующих ключевых этапов:</w:t>
+        <w:rPr>
+          <w:rFonts w:ascii="Times New Roman" w:hAnsi="Times New Roman" w:cs="Times New Roman"/>
+          <w:sz w:val="24"/>
+          <w:szCs w:val="24"/>
+        </w:rPr>
+        <w:t>Регулировка громкости звуковых эффектов</w:t>
       </w:r>
     </w:p>
     <w:p>
       <w:pPr>
-        <w:pStyle w:val="ad"/>
+        <w:pStyle w:val="a9"/>
         <w:numPr>
-          <w:ilvl w:val="0"/>
-          <w:numId w:val="7"/>
+          <w:ilvl w:val="1"/>
+          <w:numId w:val="9"/>
         </w:numPr>
+        <w:spacing w:line="278" w:lineRule="auto"/>
+        <w:rPr>
+          <w:rFonts w:ascii="Times New Roman" w:hAnsi="Times New Roman" w:cs="Times New Roman"/>
+          <w:sz w:val="24"/>
+          <w:szCs w:val="24"/>
+        </w:rPr>
       </w:pPr>
       <w:r>
-        <w:t>Генерация графа</w:t>
-      </w:r>
-      <w:r>
-        <w:t>.</w:t>
-      </w:r>
-      <w:r>
-        <w:t xml:space="preserve"> На основе заданного размера сетки (</w:t>
-      </w:r>
-      <w:proofErr w:type="spellStart"/>
-      <w:r>
-        <w:t>rows</w:t>
-      </w:r>
-      <w:proofErr w:type="spellEnd"/>
-      <w:r>
-        <w:t xml:space="preserve"> × </w:t>
-      </w:r>
-      <w:proofErr w:type="spellStart"/>
-      <w:r>
-        <w:t>cols</w:t>
-      </w:r>
-      <w:proofErr w:type="spellEnd"/>
-      <w:r>
-        <w:t xml:space="preserve">) создается </w:t>
-      </w:r>
-      <w:r>
-        <w:t>сетка из</w:t>
-      </w:r>
-      <w:r>
-        <w:t xml:space="preserve"> точек, для которо</w:t>
-      </w:r>
-      <w:r>
-        <w:t>й</w:t>
-      </w:r>
-      <w:r>
-        <w:t xml:space="preserve"> строится триангуляция Делоне. </w:t>
+        <w:rPr>
+          <w:rFonts w:ascii="Times New Roman" w:hAnsi="Times New Roman" w:cs="Times New Roman"/>
+          <w:sz w:val="24"/>
+          <w:szCs w:val="24"/>
+        </w:rPr>
+        <w:t>Переключение языка интерфейса</w:t>
       </w:r>
     </w:p>
     <w:p>
       <w:pPr>
-        <w:pStyle w:val="ad"/>
+        <w:pStyle w:val="a9"/>
         <w:numPr>
           <w:ilvl w:val="0"/>
-          <w:numId w:val="7"/>
+          <w:numId w:val="9"/>
         </w:numPr>
+        <w:spacing w:line="278" w:lineRule="auto"/>
+        <w:rPr>
+          <w:rFonts w:ascii="Times New Roman" w:hAnsi="Times New Roman" w:cs="Times New Roman"/>
+          <w:sz w:val="24"/>
+          <w:szCs w:val="24"/>
+        </w:rPr>
       </w:pPr>
       <w:r>
-        <w:t>Построение связующего пути</w:t>
-      </w:r>
-      <w:r>
-        <w:t>.</w:t>
-      </w:r>
-      <w:r>
-        <w:t xml:space="preserve"> В сгенерированном графе с помощью алгоритма DFS (</w:t>
-      </w:r>
-      <w:proofErr w:type="spellStart"/>
-      <w:r>
-        <w:t>Depth</w:t>
-      </w:r>
-      <w:proofErr w:type="spellEnd"/>
-      <w:r>
-        <w:t>-First Search) строится минимальный связующий путь, который используется для инициализации набора активных, изменяемых ребер</w:t>
-      </w:r>
-      <w:r>
-        <w:t xml:space="preserve"> каждой вершины.</w:t>
+        <w:rPr>
+          <w:rFonts w:ascii="Times New Roman" w:hAnsi="Times New Roman" w:cs="Times New Roman"/>
+          <w:sz w:val="24"/>
+          <w:szCs w:val="24"/>
+        </w:rPr>
+        <w:t>Управление уровнями:</w:t>
       </w:r>
     </w:p>
     <w:p>
       <w:pPr>
-        <w:pStyle w:val="ad"/>
+        <w:pStyle w:val="a9"/>
         <w:numPr>
-          <w:ilvl w:val="0"/>
-          <w:numId w:val="7"/>
+          <w:ilvl w:val="1"/>
+          <w:numId w:val="9"/>
         </w:numPr>
+        <w:spacing w:line="278" w:lineRule="auto"/>
+        <w:rPr>
+          <w:rFonts w:ascii="Times New Roman" w:hAnsi="Times New Roman" w:cs="Times New Roman"/>
+          <w:sz w:val="24"/>
+          <w:szCs w:val="24"/>
+        </w:rPr>
       </w:pPr>
       <w:r>
-        <w:t>Визуализация</w:t>
-      </w:r>
-      <w:r>
-        <w:t>.</w:t>
-      </w:r>
-      <w:r>
-        <w:t xml:space="preserve"> Созданный граф отображается в сцене </w:t>
-      </w:r>
-      <w:proofErr w:type="spellStart"/>
-      <w:r>
-        <w:t>Unity</w:t>
-      </w:r>
-      <w:proofErr w:type="spellEnd"/>
-      <w:r>
-        <w:t>: вершины — как интерактивные кнопки (</w:t>
-      </w:r>
-      <w:proofErr w:type="spellStart"/>
-      <w:r>
-        <w:t>GameObject</w:t>
-      </w:r>
-      <w:proofErr w:type="spellEnd"/>
-      <w:r>
-        <w:t>), а активные ребра — как линии (</w:t>
-      </w:r>
-      <w:proofErr w:type="spellStart"/>
-      <w:r>
-        <w:t>LineRenderer</w:t>
-      </w:r>
-      <w:proofErr w:type="spellEnd"/>
-      <w:r>
-        <w:t>).</w:t>
+        <w:rPr>
+          <w:rFonts w:ascii="Times New Roman" w:hAnsi="Times New Roman" w:cs="Times New Roman"/>
+          <w:sz w:val="24"/>
+          <w:szCs w:val="24"/>
+        </w:rPr>
+        <w:t>Навигация между уровнями стрелками</w:t>
       </w:r>
     </w:p>
     <w:p>
       <w:pPr>
-        <w:pStyle w:val="ad"/>
+        <w:pStyle w:val="a9"/>
         <w:numPr>
-          <w:ilvl w:val="0"/>
-          <w:numId w:val="7"/>
+          <w:ilvl w:val="1"/>
+          <w:numId w:val="9"/>
         </w:numPr>
+        <w:spacing w:line="278" w:lineRule="auto"/>
+        <w:rPr>
+          <w:rFonts w:ascii="Times New Roman" w:hAnsi="Times New Roman" w:cs="Times New Roman"/>
+          <w:sz w:val="24"/>
+          <w:szCs w:val="24"/>
+        </w:rPr>
       </w:pPr>
       <w:r>
-        <w:t xml:space="preserve">Интерактивное редактирование: Пользователь может кликать на вершины. При </w:t>
-      </w:r>
-      <w:r>
-        <w:t>нажатии</w:t>
-      </w:r>
-      <w:r>
-        <w:t xml:space="preserve"> все активные ребра, связанные с этой вершиной, совершают циклическое вращение — они отсоединяются от одного соседа и </w:t>
-      </w:r>
-      <w:proofErr w:type="spellStart"/>
-      <w:r>
-        <w:t>переподключаются</w:t>
-      </w:r>
-      <w:proofErr w:type="spellEnd"/>
-      <w:r>
-        <w:t xml:space="preserve"> к следующему</w:t>
-      </w:r>
-      <w:r>
-        <w:t>, что</w:t>
-      </w:r>
-      <w:r>
-        <w:t xml:space="preserve"> визуально изменяет конфигурацию графа.</w:t>
+        <w:rPr>
+          <w:rFonts w:ascii="Times New Roman" w:hAnsi="Times New Roman" w:cs="Times New Roman"/>
+          <w:sz w:val="24"/>
+          <w:szCs w:val="24"/>
+        </w:rPr>
+        <w:t>Просмотр таблицы рекордов выбранного типа уровня</w:t>
       </w:r>
     </w:p>
     <w:p>
       <w:pPr>
-        <w:pStyle w:val="ad"/>
+        <w:pStyle w:val="a9"/>
+        <w:numPr>
+          <w:ilvl w:val="1"/>
+          <w:numId w:val="9"/>
+        </w:numPr>
+        <w:spacing w:line="278" w:lineRule="auto"/>
+        <w:rPr>
+          <w:rFonts w:ascii="Times New Roman" w:hAnsi="Times New Roman" w:cs="Times New Roman"/>
+          <w:sz w:val="24"/>
+          <w:szCs w:val="24"/>
+        </w:rPr>
       </w:pPr>
       <w:r>
-        <w:t>Программный комплекс реализует следующие функции:</w:t>
+        <w:rPr>
+          <w:rFonts w:ascii="Times New Roman" w:hAnsi="Times New Roman" w:cs="Times New Roman"/>
+          <w:sz w:val="24"/>
+          <w:szCs w:val="24"/>
+        </w:rPr>
+        <w:t>Запуск уровня выбранного типа</w:t>
       </w:r>
     </w:p>
     <w:p>
       <w:pPr>
-        <w:pStyle w:val="ad"/>
+        <w:pStyle w:val="a9"/>
         <w:numPr>
           <w:ilvl w:val="0"/>
-          <w:numId w:val="8"/>
+          <w:numId w:val="9"/>
         </w:numPr>
+        <w:spacing w:line="278" w:lineRule="auto"/>
+        <w:rPr>
+          <w:rFonts w:ascii="Times New Roman" w:hAnsi="Times New Roman" w:cs="Times New Roman"/>
+          <w:sz w:val="24"/>
+          <w:szCs w:val="24"/>
+        </w:rPr>
       </w:pPr>
       <w:r>
-        <w:t>Создание интерактивного визуального представления графа в 2D-пространстве.</w:t>
+        <w:rPr>
+          <w:rFonts w:ascii="Times New Roman" w:hAnsi="Times New Roman" w:cs="Times New Roman"/>
+          <w:sz w:val="24"/>
+          <w:szCs w:val="24"/>
+        </w:rPr>
+        <w:t>Игровой процесс:</w:t>
       </w:r>
     </w:p>
     <w:p>
       <w:pPr>
-        <w:pStyle w:val="ad"/>
+        <w:pStyle w:val="a9"/>
         <w:numPr>
-          <w:ilvl w:val="0"/>
-          <w:numId w:val="8"/>
+          <w:ilvl w:val="1"/>
+          <w:numId w:val="9"/>
         </w:numPr>
+        <w:spacing w:line="278" w:lineRule="auto"/>
+        <w:rPr>
+          <w:rFonts w:ascii="Times New Roman" w:hAnsi="Times New Roman" w:cs="Times New Roman"/>
+          <w:sz w:val="24"/>
+          <w:szCs w:val="24"/>
+        </w:rPr>
       </w:pPr>
       <w:r>
-        <w:t>Механика динамического перенаправления ребер графа через циклическое переключение между соседями вершины.</w:t>
+        <w:rPr>
+          <w:rFonts w:ascii="Times New Roman" w:hAnsi="Times New Roman" w:cs="Times New Roman"/>
+          <w:sz w:val="24"/>
+          <w:szCs w:val="24"/>
+        </w:rPr>
+        <w:t>Процедурная генерация игрового поля</w:t>
       </w:r>
     </w:p>
     <w:p>
       <w:pPr>
-        <w:pStyle w:val="ad"/>
+        <w:pStyle w:val="a9"/>
+        <w:numPr>
+          <w:ilvl w:val="1"/>
+          <w:numId w:val="9"/>
+        </w:numPr>
+        <w:spacing w:line="278" w:lineRule="auto"/>
+        <w:rPr>
+          <w:rFonts w:ascii="Times New Roman" w:hAnsi="Times New Roman" w:cs="Times New Roman"/>
+          <w:sz w:val="24"/>
+          <w:szCs w:val="24"/>
+        </w:rPr>
       </w:pPr>
       <w:r>
-        <w:t xml:space="preserve">Данный функционал </w:t>
-      </w:r>
-      <w:r>
-        <w:t xml:space="preserve">является </w:t>
-      </w:r>
-      <w:r>
-        <w:t>реализацией</w:t>
-      </w:r>
-      <w:r>
-        <w:t xml:space="preserve"> алгоритма, который будет использоваться в итоговой </w:t>
-      </w:r>
-      <w:r>
-        <w:t>версии</w:t>
-      </w:r>
-      <w:r>
-        <w:t xml:space="preserve"> игры «Цветение».</w:t>
+        <w:rPr>
+          <w:rFonts w:ascii="Times New Roman" w:hAnsi="Times New Roman" w:cs="Times New Roman"/>
+          <w:sz w:val="24"/>
+          <w:szCs w:val="24"/>
+        </w:rPr>
+        <w:t>Взаимодействие с вершинами графа</w:t>
       </w:r>
     </w:p>
     <w:p>
       <w:pPr>
-        <w:pStyle w:val="ad"/>
+        <w:pStyle w:val="a9"/>
+        <w:numPr>
+          <w:ilvl w:val="1"/>
+          <w:numId w:val="9"/>
+        </w:numPr>
+        <w:spacing w:line="278" w:lineRule="auto"/>
+        <w:rPr>
+          <w:rFonts w:ascii="Times New Roman" w:hAnsi="Times New Roman" w:cs="Times New Roman"/>
+          <w:sz w:val="24"/>
+          <w:szCs w:val="24"/>
+        </w:rPr>
+      </w:pPr>
+      <w:r>
+        <w:rPr>
+          <w:rFonts w:ascii="Times New Roman" w:hAnsi="Times New Roman" w:cs="Times New Roman"/>
+          <w:sz w:val="24"/>
+          <w:szCs w:val="24"/>
+        </w:rPr>
+        <w:t>Вращение ребер вершины (уровень типа 1)</w:t>
+      </w:r>
+    </w:p>
+    <w:p>
+      <w:pPr>
+        <w:pStyle w:val="a9"/>
+        <w:numPr>
+          <w:ilvl w:val="1"/>
+          <w:numId w:val="9"/>
+        </w:numPr>
+        <w:spacing w:line="278" w:lineRule="auto"/>
+        <w:rPr>
+          <w:rFonts w:ascii="Times New Roman" w:hAnsi="Times New Roman" w:cs="Times New Roman"/>
+          <w:sz w:val="24"/>
+          <w:szCs w:val="24"/>
+        </w:rPr>
+      </w:pPr>
+      <w:r>
+        <w:rPr>
+          <w:rFonts w:ascii="Times New Roman" w:hAnsi="Times New Roman" w:cs="Times New Roman"/>
+          <w:sz w:val="24"/>
+          <w:szCs w:val="24"/>
+        </w:rPr>
+        <w:t>Распределение потока по ребрам (уровень типа 2)</w:t>
+      </w:r>
+    </w:p>
+    <w:p>
+      <w:pPr>
+        <w:pStyle w:val="a9"/>
+        <w:numPr>
+          <w:ilvl w:val="1"/>
+          <w:numId w:val="9"/>
+        </w:numPr>
+        <w:spacing w:line="278" w:lineRule="auto"/>
+        <w:rPr>
+          <w:rFonts w:ascii="Times New Roman" w:hAnsi="Times New Roman" w:cs="Times New Roman"/>
+          <w:sz w:val="24"/>
+          <w:szCs w:val="24"/>
+        </w:rPr>
+      </w:pPr>
+      <w:r>
+        <w:rPr>
+          <w:rFonts w:ascii="Times New Roman" w:hAnsi="Times New Roman" w:cs="Times New Roman"/>
+          <w:sz w:val="24"/>
+          <w:szCs w:val="24"/>
+        </w:rPr>
+        <w:t>Отображение таймера прохождения</w:t>
+      </w:r>
+    </w:p>
+    <w:p>
+      <w:pPr>
+        <w:pStyle w:val="a9"/>
+        <w:numPr>
+          <w:ilvl w:val="1"/>
+          <w:numId w:val="9"/>
+        </w:numPr>
+        <w:spacing w:line="278" w:lineRule="auto"/>
+        <w:rPr>
+          <w:rFonts w:ascii="Times New Roman" w:hAnsi="Times New Roman" w:cs="Times New Roman"/>
+          <w:sz w:val="24"/>
+          <w:szCs w:val="24"/>
+        </w:rPr>
+      </w:pPr>
+      <w:r>
+        <w:rPr>
+          <w:rFonts w:ascii="Times New Roman" w:hAnsi="Times New Roman" w:cs="Times New Roman"/>
+          <w:sz w:val="24"/>
+          <w:szCs w:val="24"/>
+        </w:rPr>
+        <w:t>Остановка игры в процессе (пауза)</w:t>
+      </w:r>
+    </w:p>
+    <w:p>
+      <w:pPr>
+        <w:pStyle w:val="a9"/>
+        <w:numPr>
+          <w:ilvl w:val="0"/>
+          <w:numId w:val="9"/>
+        </w:numPr>
+        <w:spacing w:line="278" w:lineRule="auto"/>
+        <w:rPr>
+          <w:rFonts w:ascii="Times New Roman" w:hAnsi="Times New Roman" w:cs="Times New Roman"/>
+          <w:sz w:val="24"/>
+          <w:szCs w:val="24"/>
+        </w:rPr>
+      </w:pPr>
+      <w:r>
+        <w:rPr>
+          <w:rFonts w:ascii="Times New Roman" w:hAnsi="Times New Roman" w:cs="Times New Roman"/>
+          <w:sz w:val="24"/>
+          <w:szCs w:val="24"/>
+        </w:rPr>
+        <w:t>Система результатов:</w:t>
+      </w:r>
+    </w:p>
+    <w:p>
+      <w:pPr>
+        <w:pStyle w:val="a9"/>
+        <w:numPr>
+          <w:ilvl w:val="1"/>
+          <w:numId w:val="9"/>
+        </w:numPr>
+        <w:spacing w:line="278" w:lineRule="auto"/>
+        <w:rPr>
+          <w:rFonts w:ascii="Times New Roman" w:hAnsi="Times New Roman" w:cs="Times New Roman"/>
+          <w:sz w:val="24"/>
+          <w:szCs w:val="24"/>
+        </w:rPr>
+      </w:pPr>
+      <w:r>
+        <w:rPr>
+          <w:rFonts w:ascii="Times New Roman" w:hAnsi="Times New Roman" w:cs="Times New Roman"/>
+          <w:sz w:val="24"/>
+          <w:szCs w:val="24"/>
+        </w:rPr>
+        <w:t>Подсчет очков по формуле на основе рекордного времени</w:t>
+      </w:r>
+    </w:p>
+    <w:p>
+      <w:pPr>
+        <w:pStyle w:val="a9"/>
+        <w:numPr>
+          <w:ilvl w:val="1"/>
+          <w:numId w:val="9"/>
+        </w:numPr>
+        <w:spacing w:line="278" w:lineRule="auto"/>
+        <w:rPr>
+          <w:rFonts w:ascii="Times New Roman" w:hAnsi="Times New Roman" w:cs="Times New Roman"/>
+          <w:sz w:val="24"/>
+          <w:szCs w:val="24"/>
+        </w:rPr>
+      </w:pPr>
+      <w:r>
+        <w:rPr>
+          <w:rFonts w:ascii="Times New Roman" w:hAnsi="Times New Roman" w:cs="Times New Roman"/>
+          <w:sz w:val="24"/>
+          <w:szCs w:val="24"/>
+        </w:rPr>
+        <w:t>Запрос рекордного времени из базы данных</w:t>
+      </w:r>
+    </w:p>
+    <w:p>
+      <w:pPr>
+        <w:pStyle w:val="a9"/>
+        <w:numPr>
+          <w:ilvl w:val="1"/>
+          <w:numId w:val="9"/>
+        </w:numPr>
+        <w:spacing w:line="278" w:lineRule="auto"/>
+        <w:rPr>
+          <w:rFonts w:ascii="Times New Roman" w:hAnsi="Times New Roman" w:cs="Times New Roman"/>
+          <w:sz w:val="24"/>
+          <w:szCs w:val="24"/>
+        </w:rPr>
+      </w:pPr>
+      <w:r>
+        <w:rPr>
+          <w:rFonts w:ascii="Times New Roman" w:hAnsi="Times New Roman" w:cs="Times New Roman"/>
+          <w:sz w:val="24"/>
+          <w:szCs w:val="24"/>
+        </w:rPr>
+        <w:t>Сохранение нового рекорда в базу данных</w:t>
+      </w:r>
+    </w:p>
+    <w:p>
+      <w:pPr>
+        <w:spacing w:line="278" w:lineRule="auto"/>
       </w:pPr>
       <w:r>
         <w:br w:type="page"/>
       </w:r>
     </w:p>
-    <w:bookmarkStart w:id="1" w:name="_Toc221121385" w:displacedByCustomXml="next"/>
+    <w:bookmarkStart w:id="1" w:name="_Toc229152400" w:displacedByCustomXml="next"/>
     <w:sdt>
       <w:sdtPr>
         <w:rPr>
@@ -4188,6 +4654,10 @@
         <w:p>
           <w:pPr>
             <w:pStyle w:val="a"/>
+            <w:numPr>
+              <w:ilvl w:val="0"/>
+              <w:numId w:val="0"/>
+            </w:numPr>
           </w:pPr>
           <w:r>
             <w:t>Содержание</w:t>
@@ -4214,13 +4684,10 @@
           <w:pPr>
             <w:pStyle w:val="11"/>
             <w:tabs>
-              <w:tab w:val="left" w:pos="480"/>
               <w:tab w:val="right" w:leader="dot" w:pos="9345"/>
             </w:tabs>
             <w:rPr>
               <w:rFonts w:ascii="Times New Roman" w:eastAsiaTheme="minorEastAsia" w:hAnsi="Times New Roman" w:cs="Times New Roman"/>
-              <w:b/>
-              <w:bCs/>
               <w:noProof/>
               <w:kern w:val="2"/>
               <w:sz w:val="24"/>
@@ -4259,50 +4726,20 @@
             </w:rPr>
             <w:fldChar w:fldCharType="separate"/>
           </w:r>
-          <w:hyperlink w:anchor="_Toc221121384" w:history="1">
+          <w:hyperlink w:anchor="_Toc229152399" w:history="1">
             <w:r>
               <w:rPr>
                 <w:rStyle w:val="aa"/>
                 <w:rFonts w:ascii="Times New Roman" w:hAnsi="Times New Roman" w:cs="Times New Roman"/>
-                <w:b/>
-                <w:bCs/>
                 <w:noProof/>
                 <w:sz w:val="24"/>
                 <w:szCs w:val="24"/>
               </w:rPr>
-              <w:t>1.</w:t>
-            </w:r>
-            <w:r>
-              <w:rPr>
-                <w:rFonts w:ascii="Times New Roman" w:eastAsiaTheme="minorEastAsia" w:hAnsi="Times New Roman" w:cs="Times New Roman"/>
-                <w:b/>
-                <w:bCs/>
-                <w:noProof/>
-                <w:kern w:val="2"/>
-                <w:sz w:val="24"/>
-                <w:szCs w:val="24"/>
-                <w:lang w:eastAsia="ru-RU"/>
-                <w14:ligatures w14:val="standardContextual"/>
-              </w:rPr>
-              <w:tab/>
-            </w:r>
-            <w:r>
-              <w:rPr>
-                <w:rStyle w:val="aa"/>
+              <w:t>АННОТАЦИЯ</w:t>
+            </w:r>
+            <w:r>
+              <w:rPr>
                 <w:rFonts w:ascii="Times New Roman" w:hAnsi="Times New Roman" w:cs="Times New Roman"/>
-                <w:b/>
-                <w:bCs/>
-                <w:noProof/>
-                <w:sz w:val="24"/>
-                <w:szCs w:val="24"/>
-              </w:rPr>
-              <w:t>АННОТАЦИЯ</w:t>
-            </w:r>
-            <w:r>
-              <w:rPr>
-                <w:rFonts w:ascii="Times New Roman" w:hAnsi="Times New Roman" w:cs="Times New Roman"/>
-                <w:b/>
-                <w:bCs/>
                 <w:noProof/>
                 <w:webHidden/>
                 <w:sz w:val="24"/>
@@ -4313,8 +4750,6 @@
             <w:r>
               <w:rPr>
                 <w:rFonts w:ascii="Times New Roman" w:hAnsi="Times New Roman" w:cs="Times New Roman"/>
-                <w:b/>
-                <w:bCs/>
                 <w:noProof/>
                 <w:webHidden/>
                 <w:sz w:val="24"/>
@@ -4325,20 +4760,16 @@
             <w:r>
               <w:rPr>
                 <w:rFonts w:ascii="Times New Roman" w:hAnsi="Times New Roman" w:cs="Times New Roman"/>
-                <w:b/>
-                <w:bCs/>
                 <w:noProof/>
                 <w:webHidden/>
                 <w:sz w:val="24"/>
                 <w:szCs w:val="24"/>
               </w:rPr>
-              <w:instrText xml:space="preserve"> PAGEREF _Toc221121384 \h </w:instrText>
+              <w:instrText xml:space="preserve"> PAGEREF _Toc229152399 \h </w:instrText>
             </w:r>
             <w:r>
               <w:rPr>
                 <w:rFonts w:ascii="Times New Roman" w:hAnsi="Times New Roman" w:cs="Times New Roman"/>
-                <w:b/>
-                <w:bCs/>
                 <w:noProof/>
                 <w:webHidden/>
                 <w:sz w:val="24"/>
@@ -4348,8 +4779,6 @@
             <w:r>
               <w:rPr>
                 <w:rFonts w:ascii="Times New Roman" w:hAnsi="Times New Roman" w:cs="Times New Roman"/>
-                <w:b/>
-                <w:bCs/>
                 <w:noProof/>
                 <w:webHidden/>
                 <w:sz w:val="24"/>
@@ -4360,8 +4789,6 @@
             <w:r>
               <w:rPr>
                 <w:rFonts w:ascii="Times New Roman" w:hAnsi="Times New Roman" w:cs="Times New Roman"/>
-                <w:b/>
-                <w:bCs/>
                 <w:noProof/>
                 <w:webHidden/>
                 <w:sz w:val="24"/>
@@ -4372,8 +4799,6 @@
             <w:r>
               <w:rPr>
                 <w:rFonts w:ascii="Times New Roman" w:hAnsi="Times New Roman" w:cs="Times New Roman"/>
-                <w:b/>
-                <w:bCs/>
                 <w:noProof/>
                 <w:webHidden/>
                 <w:sz w:val="24"/>
@@ -4387,13 +4812,10 @@
           <w:pPr>
             <w:pStyle w:val="11"/>
             <w:tabs>
-              <w:tab w:val="left" w:pos="480"/>
               <w:tab w:val="right" w:leader="dot" w:pos="9345"/>
             </w:tabs>
             <w:rPr>
               <w:rFonts w:ascii="Times New Roman" w:eastAsiaTheme="minorEastAsia" w:hAnsi="Times New Roman" w:cs="Times New Roman"/>
-              <w:b/>
-              <w:bCs/>
               <w:noProof/>
               <w:kern w:val="2"/>
               <w:sz w:val="24"/>
@@ -4402,50 +4824,20 @@
               <w14:ligatures w14:val="standardContextual"/>
             </w:rPr>
           </w:pPr>
-          <w:hyperlink w:anchor="_Toc221121385" w:history="1">
+          <w:hyperlink w:anchor="_Toc229152400" w:history="1">
             <w:r>
               <w:rPr>
                 <w:rStyle w:val="aa"/>
                 <w:rFonts w:ascii="Times New Roman" w:hAnsi="Times New Roman" w:cs="Times New Roman"/>
-                <w:b/>
-                <w:bCs/>
                 <w:noProof/>
                 <w:sz w:val="24"/>
                 <w:szCs w:val="24"/>
               </w:rPr>
-              <w:t>2.</w:t>
-            </w:r>
-            <w:r>
-              <w:rPr>
-                <w:rFonts w:ascii="Times New Roman" w:eastAsiaTheme="minorEastAsia" w:hAnsi="Times New Roman" w:cs="Times New Roman"/>
-                <w:b/>
-                <w:bCs/>
-                <w:noProof/>
-                <w:kern w:val="2"/>
-                <w:sz w:val="24"/>
-                <w:szCs w:val="24"/>
-                <w:lang w:eastAsia="ru-RU"/>
-                <w14:ligatures w14:val="standardContextual"/>
-              </w:rPr>
-              <w:tab/>
-            </w:r>
-            <w:r>
-              <w:rPr>
-                <w:rStyle w:val="aa"/>
+              <w:t>Содержание</w:t>
+            </w:r>
+            <w:r>
+              <w:rPr>
                 <w:rFonts w:ascii="Times New Roman" w:hAnsi="Times New Roman" w:cs="Times New Roman"/>
-                <w:b/>
-                <w:bCs/>
-                <w:noProof/>
-                <w:sz w:val="24"/>
-                <w:szCs w:val="24"/>
-              </w:rPr>
-              <w:t>Содержание</w:t>
-            </w:r>
-            <w:r>
-              <w:rPr>
-                <w:rFonts w:ascii="Times New Roman" w:hAnsi="Times New Roman" w:cs="Times New Roman"/>
-                <w:b/>
-                <w:bCs/>
                 <w:noProof/>
                 <w:webHidden/>
                 <w:sz w:val="24"/>
@@ -4456,8 +4848,6 @@
             <w:r>
               <w:rPr>
                 <w:rFonts w:ascii="Times New Roman" w:hAnsi="Times New Roman" w:cs="Times New Roman"/>
-                <w:b/>
-                <w:bCs/>
                 <w:noProof/>
                 <w:webHidden/>
                 <w:sz w:val="24"/>
@@ -4468,20 +4858,16 @@
             <w:r>
               <w:rPr>
                 <w:rFonts w:ascii="Times New Roman" w:hAnsi="Times New Roman" w:cs="Times New Roman"/>
-                <w:b/>
-                <w:bCs/>
                 <w:noProof/>
                 <w:webHidden/>
                 <w:sz w:val="24"/>
                 <w:szCs w:val="24"/>
               </w:rPr>
-              <w:instrText xml:space="preserve"> PAGEREF _Toc221121385 \h </w:instrText>
+              <w:instrText xml:space="preserve"> PAGEREF _Toc229152400 \h </w:instrText>
             </w:r>
             <w:r>
               <w:rPr>
                 <w:rFonts w:ascii="Times New Roman" w:hAnsi="Times New Roman" w:cs="Times New Roman"/>
-                <w:b/>
-                <w:bCs/>
                 <w:noProof/>
                 <w:webHidden/>
                 <w:sz w:val="24"/>
@@ -4491,8 +4877,6 @@
             <w:r>
               <w:rPr>
                 <w:rFonts w:ascii="Times New Roman" w:hAnsi="Times New Roman" w:cs="Times New Roman"/>
-                <w:b/>
-                <w:bCs/>
                 <w:noProof/>
                 <w:webHidden/>
                 <w:sz w:val="24"/>
@@ -4503,8 +4887,6 @@
             <w:r>
               <w:rPr>
                 <w:rFonts w:ascii="Times New Roman" w:hAnsi="Times New Roman" w:cs="Times New Roman"/>
-                <w:b/>
-                <w:bCs/>
                 <w:noProof/>
                 <w:webHidden/>
                 <w:sz w:val="24"/>
@@ -4515,8 +4897,6 @@
             <w:r>
               <w:rPr>
                 <w:rFonts w:ascii="Times New Roman" w:hAnsi="Times New Roman" w:cs="Times New Roman"/>
-                <w:b/>
-                <w:bCs/>
                 <w:noProof/>
                 <w:webHidden/>
                 <w:sz w:val="24"/>
@@ -4530,13 +4910,10 @@
           <w:pPr>
             <w:pStyle w:val="11"/>
             <w:tabs>
-              <w:tab w:val="left" w:pos="480"/>
               <w:tab w:val="right" w:leader="dot" w:pos="9345"/>
             </w:tabs>
             <w:rPr>
               <w:rFonts w:ascii="Times New Roman" w:eastAsiaTheme="minorEastAsia" w:hAnsi="Times New Roman" w:cs="Times New Roman"/>
-              <w:b/>
-              <w:bCs/>
               <w:noProof/>
               <w:kern w:val="2"/>
               <w:sz w:val="24"/>
@@ -4545,50 +4922,20 @@
               <w14:ligatures w14:val="standardContextual"/>
             </w:rPr>
           </w:pPr>
-          <w:hyperlink w:anchor="_Toc221121386" w:history="1">
+          <w:hyperlink w:anchor="_Toc229152401" w:history="1">
             <w:r>
               <w:rPr>
                 <w:rStyle w:val="aa"/>
                 <w:rFonts w:ascii="Times New Roman" w:hAnsi="Times New Roman" w:cs="Times New Roman"/>
-                <w:b/>
-                <w:bCs/>
                 <w:noProof/>
                 <w:sz w:val="24"/>
                 <w:szCs w:val="24"/>
               </w:rPr>
-              <w:t>3.</w:t>
-            </w:r>
-            <w:r>
-              <w:rPr>
-                <w:rFonts w:ascii="Times New Roman" w:eastAsiaTheme="minorEastAsia" w:hAnsi="Times New Roman" w:cs="Times New Roman"/>
-                <w:b/>
-                <w:bCs/>
-                <w:noProof/>
-                <w:kern w:val="2"/>
-                <w:sz w:val="24"/>
-                <w:szCs w:val="24"/>
-                <w:lang w:eastAsia="ru-RU"/>
-                <w14:ligatures w14:val="standardContextual"/>
-              </w:rPr>
-              <w:tab/>
-            </w:r>
-            <w:r>
-              <w:rPr>
-                <w:rStyle w:val="aa"/>
+              <w:t>Код программы</w:t>
+            </w:r>
+            <w:r>
+              <w:rPr>
                 <w:rFonts w:ascii="Times New Roman" w:hAnsi="Times New Roman" w:cs="Times New Roman"/>
-                <w:b/>
-                <w:bCs/>
-                <w:noProof/>
-                <w:sz w:val="24"/>
-                <w:szCs w:val="24"/>
-              </w:rPr>
-              <w:t>Код программы</w:t>
-            </w:r>
-            <w:r>
-              <w:rPr>
-                <w:rFonts w:ascii="Times New Roman" w:hAnsi="Times New Roman" w:cs="Times New Roman"/>
-                <w:b/>
-                <w:bCs/>
                 <w:noProof/>
                 <w:webHidden/>
                 <w:sz w:val="24"/>
@@ -4599,8 +4946,6 @@
             <w:r>
               <w:rPr>
                 <w:rFonts w:ascii="Times New Roman" w:hAnsi="Times New Roman" w:cs="Times New Roman"/>
-                <w:b/>
-                <w:bCs/>
                 <w:noProof/>
                 <w:webHidden/>
                 <w:sz w:val="24"/>
@@ -4611,20 +4956,16 @@
             <w:r>
               <w:rPr>
                 <w:rFonts w:ascii="Times New Roman" w:hAnsi="Times New Roman" w:cs="Times New Roman"/>
-                <w:b/>
-                <w:bCs/>
                 <w:noProof/>
                 <w:webHidden/>
                 <w:sz w:val="24"/>
                 <w:szCs w:val="24"/>
               </w:rPr>
-              <w:instrText xml:space="preserve"> PAGEREF _Toc221121386 \h </w:instrText>
+              <w:instrText xml:space="preserve"> PAGEREF _Toc229152401 \h </w:instrText>
             </w:r>
             <w:r>
               <w:rPr>
                 <w:rFonts w:ascii="Times New Roman" w:hAnsi="Times New Roman" w:cs="Times New Roman"/>
-                <w:b/>
-                <w:bCs/>
                 <w:noProof/>
                 <w:webHidden/>
                 <w:sz w:val="24"/>
@@ -4634,8 +4975,6 @@
             <w:r>
               <w:rPr>
                 <w:rFonts w:ascii="Times New Roman" w:hAnsi="Times New Roman" w:cs="Times New Roman"/>
-                <w:b/>
-                <w:bCs/>
                 <w:noProof/>
                 <w:webHidden/>
                 <w:sz w:val="24"/>
@@ -4646,8 +4985,6 @@
             <w:r>
               <w:rPr>
                 <w:rFonts w:ascii="Times New Roman" w:hAnsi="Times New Roman" w:cs="Times New Roman"/>
-                <w:b/>
-                <w:bCs/>
                 <w:noProof/>
                 <w:webHidden/>
                 <w:sz w:val="24"/>
@@ -4658,8 +4995,6 @@
             <w:r>
               <w:rPr>
                 <w:rFonts w:ascii="Times New Roman" w:hAnsi="Times New Roman" w:cs="Times New Roman"/>
-                <w:b/>
-                <w:bCs/>
                 <w:noProof/>
                 <w:webHidden/>
                 <w:sz w:val="24"/>
@@ -4673,13 +5008,10 @@
           <w:pPr>
             <w:pStyle w:val="11"/>
             <w:tabs>
-              <w:tab w:val="left" w:pos="480"/>
               <w:tab w:val="right" w:leader="dot" w:pos="9345"/>
             </w:tabs>
             <w:rPr>
               <w:rFonts w:ascii="Times New Roman" w:eastAsiaTheme="minorEastAsia" w:hAnsi="Times New Roman" w:cs="Times New Roman"/>
-              <w:b/>
-              <w:bCs/>
               <w:noProof/>
               <w:kern w:val="2"/>
               <w:sz w:val="24"/>
@@ -4688,50 +5020,20 @@
               <w14:ligatures w14:val="standardContextual"/>
             </w:rPr>
           </w:pPr>
-          <w:hyperlink w:anchor="_Toc221121387" w:history="1">
+          <w:hyperlink w:anchor="_Toc229152402" w:history="1">
             <w:r>
               <w:rPr>
                 <w:rStyle w:val="aa"/>
                 <w:rFonts w:ascii="Times New Roman" w:hAnsi="Times New Roman" w:cs="Times New Roman"/>
-                <w:b/>
-                <w:bCs/>
                 <w:noProof/>
                 <w:sz w:val="24"/>
                 <w:szCs w:val="24"/>
               </w:rPr>
-              <w:t>4.</w:t>
-            </w:r>
-            <w:r>
-              <w:rPr>
-                <w:rFonts w:ascii="Times New Roman" w:eastAsiaTheme="minorEastAsia" w:hAnsi="Times New Roman" w:cs="Times New Roman"/>
-                <w:b/>
-                <w:bCs/>
-                <w:noProof/>
-                <w:kern w:val="2"/>
-                <w:sz w:val="24"/>
-                <w:szCs w:val="24"/>
-                <w:lang w:eastAsia="ru-RU"/>
-                <w14:ligatures w14:val="standardContextual"/>
-              </w:rPr>
-              <w:tab/>
-            </w:r>
-            <w:r>
-              <w:rPr>
-                <w:rStyle w:val="aa"/>
+              <w:t>ЛИСТ РЕГИСТРАЦИИ ИЗМЕНЕНИЙ</w:t>
+            </w:r>
+            <w:r>
+              <w:rPr>
                 <w:rFonts w:ascii="Times New Roman" w:hAnsi="Times New Roman" w:cs="Times New Roman"/>
-                <w:b/>
-                <w:bCs/>
-                <w:noProof/>
-                <w:sz w:val="24"/>
-                <w:szCs w:val="24"/>
-              </w:rPr>
-              <w:t>ЛИСТ РЕГИСТРАЦИИ ИЗМЕНЕНИЙ</w:t>
-            </w:r>
-            <w:r>
-              <w:rPr>
-                <w:rFonts w:ascii="Times New Roman" w:hAnsi="Times New Roman" w:cs="Times New Roman"/>
-                <w:b/>
-                <w:bCs/>
                 <w:noProof/>
                 <w:webHidden/>
                 <w:sz w:val="24"/>
@@ -4742,8 +5044,6 @@
             <w:r>
               <w:rPr>
                 <w:rFonts w:ascii="Times New Roman" w:hAnsi="Times New Roman" w:cs="Times New Roman"/>
-                <w:b/>
-                <w:bCs/>
                 <w:noProof/>
                 <w:webHidden/>
                 <w:sz w:val="24"/>
@@ -4754,20 +5054,16 @@
             <w:r>
               <w:rPr>
                 <w:rFonts w:ascii="Times New Roman" w:hAnsi="Times New Roman" w:cs="Times New Roman"/>
-                <w:b/>
-                <w:bCs/>
                 <w:noProof/>
                 <w:webHidden/>
                 <w:sz w:val="24"/>
                 <w:szCs w:val="24"/>
               </w:rPr>
-              <w:instrText xml:space="preserve"> PAGEREF _Toc221121387 \h </w:instrText>
+              <w:instrText xml:space="preserve"> PAGEREF _Toc229152402 \h </w:instrText>
             </w:r>
             <w:r>
               <w:rPr>
                 <w:rFonts w:ascii="Times New Roman" w:hAnsi="Times New Roman" w:cs="Times New Roman"/>
-                <w:b/>
-                <w:bCs/>
                 <w:noProof/>
                 <w:webHidden/>
                 <w:sz w:val="24"/>
@@ -4777,8 +5073,6 @@
             <w:r>
               <w:rPr>
                 <w:rFonts w:ascii="Times New Roman" w:hAnsi="Times New Roman" w:cs="Times New Roman"/>
-                <w:b/>
-                <w:bCs/>
                 <w:noProof/>
                 <w:webHidden/>
                 <w:sz w:val="24"/>
@@ -4789,8 +5083,6 @@
             <w:r>
               <w:rPr>
                 <w:rFonts w:ascii="Times New Roman" w:hAnsi="Times New Roman" w:cs="Times New Roman"/>
-                <w:b/>
-                <w:bCs/>
                 <w:noProof/>
                 <w:webHidden/>
                 <w:sz w:val="24"/>
@@ -4801,8 +5093,6 @@
             <w:r>
               <w:rPr>
                 <w:rFonts w:ascii="Times New Roman" w:hAnsi="Times New Roman" w:cs="Times New Roman"/>
-                <w:b/>
-                <w:bCs/>
                 <w:noProof/>
                 <w:webHidden/>
                 <w:sz w:val="24"/>
@@ -4858,8 +5148,12 @@
     <w:p>
       <w:pPr>
         <w:pStyle w:val="a"/>
-      </w:pPr>
-      <w:bookmarkStart w:id="2" w:name="_Toc221121386"/>
+        <w:numPr>
+          <w:ilvl w:val="0"/>
+          <w:numId w:val="0"/>
+        </w:numPr>
+      </w:pPr>
+      <w:bookmarkStart w:id="2" w:name="_Toc229152401"/>
       <w:r>
         <w:lastRenderedPageBreak/>
         <w:t>Код программы</w:t>
@@ -4910,18 +5204,13 @@
         </w:rPr>
         <w:t xml:space="preserve"> репозитории по ссылке: </w:t>
       </w:r>
-      <w:hyperlink r:id="rId10" w:history="1">
-        <w:r>
-          <w:rPr>
-            <w:rStyle w:val="aa"/>
-            <w:rFonts w:ascii="Times New Roman" w:eastAsia="Times New Roman" w:hAnsi="Times New Roman" w:cs="Times New Roman"/>
-            <w:sz w:val="24"/>
-            <w:szCs w:val="24"/>
-            <w:lang w:eastAsia="ru-RU"/>
-          </w:rPr>
-          <w:t>https://github.com/nektosomebody/Blossom.git</w:t>
-        </w:r>
-      </w:hyperlink>
+      <w:r>
+        <w:rPr>
+          <w:rStyle w:val="ae"/>
+          <w:rFonts w:eastAsiaTheme="minorHAnsi"/>
+        </w:rPr>
+        <w:t>https://github.com/nektosomebody/Blossom1</w:t>
+      </w:r>
     </w:p>
     <w:p>
       <w:pPr>
@@ -4945,8 +5234,12 @@
     <w:p>
       <w:pPr>
         <w:pStyle w:val="a"/>
-      </w:pPr>
-      <w:bookmarkStart w:id="3" w:name="_Toc221121387"/>
+        <w:numPr>
+          <w:ilvl w:val="0"/>
+          <w:numId w:val="0"/>
+        </w:numPr>
+      </w:pPr>
+      <w:bookmarkStart w:id="3" w:name="_Toc229152402"/>
       <w:r>
         <w:lastRenderedPageBreak/>
         <w:t>ЛИСТ РЕГИСТРАЦИИ ИЗМЕНЕНИЙ</w:t>
@@ -12162,6 +12455,92 @@
     </w:lvl>
   </w:abstractNum>
   <w:abstractNum w:abstractNumId="6" w15:restartNumberingAfterBreak="0">
+    <w:nsid w:val="67045917"/>
+    <w:multiLevelType w:val="multilevel"/>
+    <w:tmpl w:val="0419001F"/>
+    <w:lvl w:ilvl="0">
+      <w:start w:val="1"/>
+      <w:numFmt w:val="decimal"/>
+      <w:lvlText w:val="%1."/>
+      <w:lvlJc w:val="left"/>
+      <w:pPr>
+        <w:ind w:left="360" w:hanging="360"/>
+      </w:pPr>
+    </w:lvl>
+    <w:lvl w:ilvl="1">
+      <w:start w:val="1"/>
+      <w:numFmt w:val="decimal"/>
+      <w:lvlText w:val="%1.%2."/>
+      <w:lvlJc w:val="left"/>
+      <w:pPr>
+        <w:ind w:left="792" w:hanging="432"/>
+      </w:pPr>
+    </w:lvl>
+    <w:lvl w:ilvl="2">
+      <w:start w:val="1"/>
+      <w:numFmt w:val="decimal"/>
+      <w:lvlText w:val="%1.%2.%3."/>
+      <w:lvlJc w:val="left"/>
+      <w:pPr>
+        <w:ind w:left="1224" w:hanging="504"/>
+      </w:pPr>
+    </w:lvl>
+    <w:lvl w:ilvl="3">
+      <w:start w:val="1"/>
+      <w:numFmt w:val="decimal"/>
+      <w:lvlText w:val="%1.%2.%3.%4."/>
+      <w:lvlJc w:val="left"/>
+      <w:pPr>
+        <w:ind w:left="1728" w:hanging="648"/>
+      </w:pPr>
+    </w:lvl>
+    <w:lvl w:ilvl="4">
+      <w:start w:val="1"/>
+      <w:numFmt w:val="decimal"/>
+      <w:lvlText w:val="%1.%2.%3.%4.%5."/>
+      <w:lvlJc w:val="left"/>
+      <w:pPr>
+        <w:ind w:left="2232" w:hanging="792"/>
+      </w:pPr>
+    </w:lvl>
+    <w:lvl w:ilvl="5">
+      <w:start w:val="1"/>
+      <w:numFmt w:val="decimal"/>
+      <w:lvlText w:val="%1.%2.%3.%4.%5.%6."/>
+      <w:lvlJc w:val="left"/>
+      <w:pPr>
+        <w:ind w:left="2736" w:hanging="936"/>
+      </w:pPr>
+    </w:lvl>
+    <w:lvl w:ilvl="6">
+      <w:start w:val="1"/>
+      <w:numFmt w:val="decimal"/>
+      <w:lvlText w:val="%1.%2.%3.%4.%5.%6.%7."/>
+      <w:lvlJc w:val="left"/>
+      <w:pPr>
+        <w:ind w:left="3240" w:hanging="1080"/>
+      </w:pPr>
+    </w:lvl>
+    <w:lvl w:ilvl="7">
+      <w:start w:val="1"/>
+      <w:numFmt w:val="decimal"/>
+      <w:lvlText w:val="%1.%2.%3.%4.%5.%6.%7.%8."/>
+      <w:lvlJc w:val="left"/>
+      <w:pPr>
+        <w:ind w:left="3744" w:hanging="1224"/>
+      </w:pPr>
+    </w:lvl>
+    <w:lvl w:ilvl="8">
+      <w:start w:val="1"/>
+      <w:numFmt w:val="decimal"/>
+      <w:lvlText w:val="%1.%2.%3.%4.%5.%6.%7.%8.%9."/>
+      <w:lvlJc w:val="left"/>
+      <w:pPr>
+        <w:ind w:left="4320" w:hanging="1440"/>
+      </w:pPr>
+    </w:lvl>
+  </w:abstractNum>
+  <w:abstractNum w:abstractNumId="7" w15:restartNumberingAfterBreak="0">
     <w:nsid w:val="728E7CF2"/>
     <w:multiLevelType w:val="hybridMultilevel"/>
     <w:tmpl w:val="43A2F19A"/>
@@ -12247,7 +12626,7 @@
       </w:pPr>
     </w:lvl>
   </w:abstractNum>
-  <w:abstractNum w:abstractNumId="7" w15:restartNumberingAfterBreak="0">
+  <w:abstractNum w:abstractNumId="8" w15:restartNumberingAfterBreak="0">
     <w:nsid w:val="755B626E"/>
     <w:multiLevelType w:val="hybridMultilevel"/>
     <w:tmpl w:val="E4DA3946"/>
@@ -12370,7 +12749,7 @@
     <w:abstractNumId w:val="2"/>
   </w:num>
   <w:num w:numId="4" w16cid:durableId="1050694153">
-    <w:abstractNumId w:val="6"/>
+    <w:abstractNumId w:val="7"/>
   </w:num>
   <w:num w:numId="5" w16cid:durableId="2013145621">
     <w:abstractNumId w:val="1"/>
@@ -12379,10 +12758,13 @@
     <w:abstractNumId w:val="0"/>
   </w:num>
   <w:num w:numId="7" w16cid:durableId="1684698516">
-    <w:abstractNumId w:val="7"/>
+    <w:abstractNumId w:val="8"/>
   </w:num>
   <w:num w:numId="8" w16cid:durableId="1144548733">
     <w:abstractNumId w:val="3"/>
+  </w:num>
+  <w:num w:numId="9" w16cid:durableId="372578634">
+    <w:abstractNumId w:val="6"/>
   </w:num>
 </w:numbering>
 </file>

</xml_diff>